<commit_message>
doc: add week11 4x step-by-step explain docx files
</commit_message>
<xml_diff>
--- a/docs/岗位/2025-2026新设央企国企子公司名单_V2.docx
+++ b/docs/岗位/2025-2026新设央企国企子公司名单_V2.docx
@@ -2600,7 +2600,800 @@
           <w:color w:val="2C3E50"/>
           <w:sz w:val="28"/>
         </w:rPr>
-        <w:t>四、完整 N档·新设扩产待核验 名单（按省份）</w:t>
+        <w:t>四、校招验证结果（2026年7月网络调研）</w:t>
+      </w:r>
+    </w:p>
+    <w:p>
+      <w:r>
+        <w:rPr>
+          <w:rFonts w:ascii="Arial" w:hAnsi="Arial"/>
+          <w:b w:val="0"/>
+          <w:sz w:val="19"/>
+        </w:rPr>
+        <w:t>以下是对名单中重点企业的校招状态逐一核实的结果，数据来源为各企业官网、招聘平台及高校就业网。</w:t>
+      </w:r>
+    </w:p>
+    <w:tbl>
+      <w:tblPr>
+        <w:tblStyle w:val="LightGrid-Accent1"/>
+        <w:tblW w:type="auto" w:w="0"/>
+        <w:jc w:val="center"/>
+        <w:tblLook w:firstColumn="1" w:firstRow="1" w:lastColumn="0" w:lastRow="0" w:noHBand="0" w:noVBand="1" w:val="04A0"/>
+      </w:tblPr>
+      <w:tblGrid>
+        <w:gridCol w:w="1560"/>
+        <w:gridCol w:w="1560"/>
+        <w:gridCol w:w="1560"/>
+        <w:gridCol w:w="1560"/>
+        <w:gridCol w:w="1560"/>
+        <w:gridCol w:w="1560"/>
+      </w:tblGrid>
+      <w:tr>
+        <w:tc>
+          <w:tcPr>
+            <w:tcW w:type="dxa" w:w="1560"/>
+          </w:tcPr>
+          <w:p>
+            <w:pPr>
+              <w:jc w:val="center"/>
+            </w:pPr>
+            <w:r>
+              <w:rPr>
+                <w:rFonts w:ascii="Arial" w:hAnsi="Arial"/>
+                <w:b/>
+                <w:sz w:val="18"/>
+              </w:rPr>
+              <w:t>企业名称</w:t>
+            </w:r>
+          </w:p>
+        </w:tc>
+        <w:tc>
+          <w:tcPr>
+            <w:tcW w:type="dxa" w:w="1560"/>
+          </w:tcPr>
+          <w:p>
+            <w:pPr>
+              <w:jc w:val="center"/>
+            </w:pPr>
+            <w:r>
+              <w:rPr>
+                <w:rFonts w:ascii="Arial" w:hAnsi="Arial"/>
+                <w:b/>
+                <w:sz w:val="18"/>
+              </w:rPr>
+              <w:t>校招状态</w:t>
+            </w:r>
+          </w:p>
+        </w:tc>
+        <w:tc>
+          <w:tcPr>
+            <w:tcW w:type="dxa" w:w="1560"/>
+          </w:tcPr>
+          <w:p>
+            <w:pPr>
+              <w:jc w:val="center"/>
+            </w:pPr>
+            <w:r>
+              <w:rPr>
+                <w:rFonts w:ascii="Arial" w:hAnsi="Arial"/>
+                <w:b/>
+                <w:sz w:val="18"/>
+              </w:rPr>
+              <w:t>对口岗位</w:t>
+            </w:r>
+          </w:p>
+        </w:tc>
+        <w:tc>
+          <w:tcPr>
+            <w:tcW w:type="dxa" w:w="1560"/>
+          </w:tcPr>
+          <w:p>
+            <w:pPr>
+              <w:jc w:val="center"/>
+            </w:pPr>
+            <w:r>
+              <w:rPr>
+                <w:rFonts w:ascii="Arial" w:hAnsi="Arial"/>
+                <w:b/>
+                <w:sz w:val="18"/>
+              </w:rPr>
+              <w:t>工作地点</w:t>
+            </w:r>
+          </w:p>
+        </w:tc>
+        <w:tc>
+          <w:tcPr>
+            <w:tcW w:type="dxa" w:w="1560"/>
+          </w:tcPr>
+          <w:p>
+            <w:pPr>
+              <w:jc w:val="center"/>
+            </w:pPr>
+            <w:r>
+              <w:rPr>
+                <w:rFonts w:ascii="Arial" w:hAnsi="Arial"/>
+                <w:b/>
+                <w:sz w:val="18"/>
+              </w:rPr>
+              <w:t>投递方式</w:t>
+            </w:r>
+          </w:p>
+        </w:tc>
+        <w:tc>
+          <w:tcPr>
+            <w:tcW w:type="dxa" w:w="1560"/>
+          </w:tcPr>
+          <w:p>
+            <w:pPr>
+              <w:jc w:val="center"/>
+            </w:pPr>
+            <w:r>
+              <w:rPr>
+                <w:rFonts w:ascii="Arial" w:hAnsi="Arial"/>
+                <w:b/>
+                <w:sz w:val="18"/>
+              </w:rPr>
+              <w:t>推荐度</w:t>
+            </w:r>
+          </w:p>
+        </w:tc>
+      </w:tr>
+      <w:tr>
+        <w:tc>
+          <w:tcPr>
+            <w:tcW w:type="dxa" w:w="1560"/>
+          </w:tcPr>
+          <w:p>
+            <w:r>
+              <w:rPr>
+                <w:rFonts w:ascii="Arial" w:hAnsi="Arial"/>
+                <w:sz w:val="18"/>
+              </w:rPr>
+              <w:t>中国电气装备集团储能科技</w:t>
+            </w:r>
+          </w:p>
+        </w:tc>
+        <w:tc>
+          <w:tcPr>
+            <w:tcW w:type="dxa" w:w="1560"/>
+          </w:tcPr>
+          <w:p>
+            <w:r>
+              <w:rPr>
+                <w:rFonts w:ascii="Arial" w:hAnsi="Arial"/>
+                <w:sz w:val="18"/>
+              </w:rPr>
+              <w:t>✅ 2026春招已开</w:t>
+              <w:br/>
+              <w:t>招~30人</w:t>
+            </w:r>
+          </w:p>
+        </w:tc>
+        <w:tc>
+          <w:tcPr>
+            <w:tcW w:type="dxa" w:w="1560"/>
+          </w:tcPr>
+          <w:p>
+            <w:r>
+              <w:rPr>
+                <w:rFonts w:ascii="Arial" w:hAnsi="Arial"/>
+                <w:sz w:val="18"/>
+              </w:rPr>
+              <w:t>PCS软件工程师</w:t>
+              <w:br/>
+              <w:t>研发工程师</w:t>
+            </w:r>
+          </w:p>
+        </w:tc>
+        <w:tc>
+          <w:tcPr>
+            <w:tcW w:type="dxa" w:w="1560"/>
+          </w:tcPr>
+          <w:p>
+            <w:r>
+              <w:rPr>
+                <w:rFonts w:ascii="Arial" w:hAnsi="Arial"/>
+                <w:sz w:val="18"/>
+              </w:rPr>
+              <w:t>上海（本部）</w:t>
+              <w:br/>
+              <w:t>许昌/天津/济南</w:t>
+            </w:r>
+          </w:p>
+        </w:tc>
+        <w:tc>
+          <w:tcPr>
+            <w:tcW w:type="dxa" w:w="1560"/>
+          </w:tcPr>
+          <w:p>
+            <w:r>
+              <w:rPr>
+                <w:rFonts w:ascii="Arial" w:hAnsi="Arial"/>
+                <w:sz w:val="18"/>
+              </w:rPr>
+              <w:t>campus.51job.com/cnkj2026</w:t>
+              <w:br/>
+              <w:t>刘老师 021-66698846</w:t>
+            </w:r>
+          </w:p>
+        </w:tc>
+        <w:tc>
+          <w:tcPr>
+            <w:tcW w:type="dxa" w:w="1560"/>
+          </w:tcPr>
+          <w:p>
+            <w:r>
+              <w:rPr>
+                <w:rFonts w:ascii="Arial" w:hAnsi="Arial"/>
+                <w:sz w:val="18"/>
+              </w:rPr>
+              <w:t>⭐⭐⭐⭐⭐</w:t>
+              <w:br/>
+              <w:t>首推</w:t>
+            </w:r>
+          </w:p>
+        </w:tc>
+      </w:tr>
+      <w:tr>
+        <w:tc>
+          <w:tcPr>
+            <w:tcW w:type="dxa" w:w="1560"/>
+          </w:tcPr>
+          <w:p>
+            <w:r>
+              <w:rPr>
+                <w:rFonts w:ascii="Arial" w:hAnsi="Arial"/>
+                <w:sz w:val="18"/>
+              </w:rPr>
+              <w:t>广州储能集团</w:t>
+            </w:r>
+          </w:p>
+        </w:tc>
+        <w:tc>
+          <w:tcPr>
+            <w:tcW w:type="dxa" w:w="1560"/>
+          </w:tcPr>
+          <w:p>
+            <w:r>
+              <w:rPr>
+                <w:rFonts w:ascii="Arial" w:hAnsi="Arial"/>
+                <w:sz w:val="18"/>
+              </w:rPr>
+              <w:t>✅ 2026校招已启动</w:t>
+            </w:r>
+          </w:p>
+        </w:tc>
+        <w:tc>
+          <w:tcPr>
+            <w:tcW w:type="dxa" w:w="1560"/>
+          </w:tcPr>
+          <w:p>
+            <w:r>
+              <w:rPr>
+                <w:rFonts w:ascii="Arial" w:hAnsi="Arial"/>
+                <w:sz w:val="18"/>
+              </w:rPr>
+              <w:t>产品研发助理工程师</w:t>
+            </w:r>
+          </w:p>
+        </w:tc>
+        <w:tc>
+          <w:tcPr>
+            <w:tcW w:type="dxa" w:w="1560"/>
+          </w:tcPr>
+          <w:p>
+            <w:r>
+              <w:rPr>
+                <w:rFonts w:ascii="Arial" w:hAnsi="Arial"/>
+                <w:sz w:val="18"/>
+              </w:rPr>
+              <w:t>广州</w:t>
+            </w:r>
+          </w:p>
+        </w:tc>
+        <w:tc>
+          <w:tcPr>
+            <w:tcW w:type="dxa" w:w="1560"/>
+          </w:tcPr>
+          <w:p>
+            <w:r>
+              <w:rPr>
+                <w:rFonts w:ascii="Arial" w:hAnsi="Arial"/>
+                <w:sz w:val="18"/>
+              </w:rPr>
+              <w:t>手机端 bjxapp.cn/t/NjMwODE3OA/</w:t>
+            </w:r>
+          </w:p>
+        </w:tc>
+        <w:tc>
+          <w:tcPr>
+            <w:tcW w:type="dxa" w:w="1560"/>
+          </w:tcPr>
+          <w:p>
+            <w:r>
+              <w:rPr>
+                <w:rFonts w:ascii="Arial" w:hAnsi="Arial"/>
+                <w:sz w:val="18"/>
+              </w:rPr>
+              <w:t>⭐⭐⭐⭐⭐</w:t>
+              <w:br/>
+              <w:t>首推</w:t>
+            </w:r>
+          </w:p>
+        </w:tc>
+      </w:tr>
+      <w:tr>
+        <w:tc>
+          <w:tcPr>
+            <w:tcW w:type="dxa" w:w="1560"/>
+          </w:tcPr>
+          <w:p>
+            <w:r>
+              <w:rPr>
+                <w:rFonts w:ascii="Arial" w:hAnsi="Arial"/>
+                <w:sz w:val="18"/>
+              </w:rPr>
+              <w:t>中国资源循环集团</w:t>
+            </w:r>
+          </w:p>
+        </w:tc>
+        <w:tc>
+          <w:tcPr>
+            <w:tcW w:type="dxa" w:w="1560"/>
+          </w:tcPr>
+          <w:p>
+            <w:r>
+              <w:rPr>
+                <w:rFonts w:ascii="Arial" w:hAnsi="Arial"/>
+                <w:sz w:val="18"/>
+              </w:rPr>
+              <w:t>✅ 2026春招已开</w:t>
+              <w:br/>
+              <w:t>秋招也有</w:t>
+            </w:r>
+          </w:p>
+        </w:tc>
+        <w:tc>
+          <w:tcPr>
+            <w:tcW w:type="dxa" w:w="1560"/>
+          </w:tcPr>
+          <w:p>
+            <w:r>
+              <w:rPr>
+                <w:rFonts w:ascii="Arial" w:hAnsi="Arial"/>
+                <w:sz w:val="18"/>
+              </w:rPr>
+              <w:t>技术专责/管培生</w:t>
+              <w:br/>
+              <w:t>工艺工程师</w:t>
+            </w:r>
+          </w:p>
+        </w:tc>
+        <w:tc>
+          <w:tcPr>
+            <w:tcW w:type="dxa" w:w="1560"/>
+          </w:tcPr>
+          <w:p>
+            <w:r>
+              <w:rPr>
+                <w:rFonts w:ascii="Arial" w:hAnsi="Arial"/>
+                <w:sz w:val="18"/>
+              </w:rPr>
+              <w:t>天津（总部）</w:t>
+              <w:br/>
+              <w:t>深圳/南京/杭州</w:t>
+            </w:r>
+          </w:p>
+        </w:tc>
+        <w:tc>
+          <w:tcPr>
+            <w:tcW w:type="dxa" w:w="1560"/>
+          </w:tcPr>
+          <w:p>
+            <w:r>
+              <w:rPr>
+                <w:rFonts w:ascii="Arial" w:hAnsi="Arial"/>
+                <w:sz w:val="18"/>
+              </w:rPr>
+              <w:t>zgzh.iguopin.com</w:t>
+            </w:r>
+          </w:p>
+        </w:tc>
+        <w:tc>
+          <w:tcPr>
+            <w:tcW w:type="dxa" w:w="1560"/>
+          </w:tcPr>
+          <w:p>
+            <w:r>
+              <w:rPr>
+                <w:rFonts w:ascii="Arial" w:hAnsi="Arial"/>
+                <w:sz w:val="18"/>
+              </w:rPr>
+              <w:t>⭐⭐⭐⭐</w:t>
+              <w:br/>
+              <w:t>专业对口</w:t>
+            </w:r>
+          </w:p>
+        </w:tc>
+      </w:tr>
+      <w:tr>
+        <w:tc>
+          <w:tcPr>
+            <w:tcW w:type="dxa" w:w="1560"/>
+          </w:tcPr>
+          <w:p>
+            <w:r>
+              <w:rPr>
+                <w:rFonts w:ascii="Arial" w:hAnsi="Arial"/>
+                <w:sz w:val="18"/>
+              </w:rPr>
+              <w:t>广东新型储能国家研究院</w:t>
+            </w:r>
+          </w:p>
+        </w:tc>
+        <w:tc>
+          <w:tcPr>
+            <w:tcW w:type="dxa" w:w="1560"/>
+          </w:tcPr>
+          <w:p>
+            <w:r>
+              <w:rPr>
+                <w:rFonts w:ascii="Arial" w:hAnsi="Arial"/>
+                <w:sz w:val="18"/>
+              </w:rPr>
+              <w:t>⚠️ 硕博为主</w:t>
+              <w:br/>
+              <w:t>部分硕可投</w:t>
+            </w:r>
+          </w:p>
+        </w:tc>
+        <w:tc>
+          <w:tcPr>
+            <w:tcW w:type="dxa" w:w="1560"/>
+          </w:tcPr>
+          <w:p>
+            <w:r>
+              <w:rPr>
+                <w:rFonts w:ascii="Arial" w:hAnsi="Arial"/>
+                <w:sz w:val="18"/>
+              </w:rPr>
+              <w:t>变流与控制副研究员</w:t>
+              <w:br/>
+              <w:t>仿真规划副研究员</w:t>
+              <w:br/>
+              <w:t>19-30k·15薪</w:t>
+            </w:r>
+          </w:p>
+        </w:tc>
+        <w:tc>
+          <w:tcPr>
+            <w:tcW w:type="dxa" w:w="1560"/>
+          </w:tcPr>
+          <w:p>
+            <w:r>
+              <w:rPr>
+                <w:rFonts w:ascii="Arial" w:hAnsi="Arial"/>
+                <w:sz w:val="18"/>
+              </w:rPr>
+              <w:t>广州白云</w:t>
+            </w:r>
+          </w:p>
+        </w:tc>
+        <w:tc>
+          <w:tcPr>
+            <w:tcW w:type="dxa" w:w="1560"/>
+          </w:tcPr>
+          <w:p>
+            <w:r>
+              <w:rPr>
+                <w:rFonts w:ascii="Arial" w:hAnsi="Arial"/>
+                <w:sz w:val="18"/>
+              </w:rPr>
+              <w:t>zhaopin@naesic.com</w:t>
+            </w:r>
+          </w:p>
+        </w:tc>
+        <w:tc>
+          <w:tcPr>
+            <w:tcW w:type="dxa" w:w="1560"/>
+          </w:tcPr>
+          <w:p>
+            <w:r>
+              <w:rPr>
+                <w:rFonts w:ascii="Arial" w:hAnsi="Arial"/>
+                <w:sz w:val="18"/>
+              </w:rPr>
+              <w:t>⭐⭐⭐</w:t>
+              <w:br/>
+              <w:t>冲刺项</w:t>
+            </w:r>
+          </w:p>
+        </w:tc>
+      </w:tr>
+      <w:tr>
+        <w:tc>
+          <w:tcPr>
+            <w:tcW w:type="dxa" w:w="1560"/>
+          </w:tcPr>
+          <w:p>
+            <w:r>
+              <w:rPr>
+                <w:rFonts w:ascii="Arial" w:hAnsi="Arial"/>
+                <w:sz w:val="18"/>
+              </w:rPr>
+              <w:t>宁德时代 CATL</w:t>
+            </w:r>
+          </w:p>
+        </w:tc>
+        <w:tc>
+          <w:tcPr>
+            <w:tcW w:type="dxa" w:w="1560"/>
+          </w:tcPr>
+          <w:p>
+            <w:r>
+              <w:rPr>
+                <w:rFonts w:ascii="Arial" w:hAnsi="Arial"/>
+                <w:sz w:val="18"/>
+              </w:rPr>
+              <w:t>✅ 2026校招进行中</w:t>
+              <w:br/>
+              <w:t>20-50w/年</w:t>
+            </w:r>
+          </w:p>
+        </w:tc>
+        <w:tc>
+          <w:tcPr>
+            <w:tcW w:type="dxa" w:w="1560"/>
+          </w:tcPr>
+          <w:p>
+            <w:r>
+              <w:rPr>
+                <w:rFonts w:ascii="Arial" w:hAnsi="Arial"/>
+                <w:sz w:val="18"/>
+              </w:rPr>
+              <w:t>BMS软件与算法</w:t>
+              <w:br/>
+              <w:t>储能系统开发</w:t>
+            </w:r>
+          </w:p>
+        </w:tc>
+        <w:tc>
+          <w:tcPr>
+            <w:tcW w:type="dxa" w:w="1560"/>
+          </w:tcPr>
+          <w:p>
+            <w:r>
+              <w:rPr>
+                <w:rFonts w:ascii="Arial" w:hAnsi="Arial"/>
+                <w:sz w:val="18"/>
+              </w:rPr>
+              <w:t>宁德/厦门/上海</w:t>
+              <w:br/>
+              <w:t>溧阳/宜宾等</w:t>
+            </w:r>
+          </w:p>
+        </w:tc>
+        <w:tc>
+          <w:tcPr>
+            <w:tcW w:type="dxa" w:w="1560"/>
+          </w:tcPr>
+          <w:p>
+            <w:r>
+              <w:rPr>
+                <w:rFonts w:ascii="Arial" w:hAnsi="Arial"/>
+                <w:sz w:val="18"/>
+              </w:rPr>
+              <w:t>Talent.CATL.com</w:t>
+              <w:br/>
+              <w:t>catl-campus@catl.com</w:t>
+            </w:r>
+          </w:p>
+        </w:tc>
+        <w:tc>
+          <w:tcPr>
+            <w:tcW w:type="dxa" w:w="1560"/>
+          </w:tcPr>
+          <w:p>
+            <w:r>
+              <w:rPr>
+                <w:rFonts w:ascii="Arial" w:hAnsi="Arial"/>
+                <w:sz w:val="18"/>
+              </w:rPr>
+              <w:t>⭐⭐⭐</w:t>
+              <w:br/>
+              <w:t>投了不亏</w:t>
+            </w:r>
+          </w:p>
+        </w:tc>
+      </w:tr>
+      <w:tr>
+        <w:tc>
+          <w:tcPr>
+            <w:tcW w:type="dxa" w:w="1560"/>
+          </w:tcPr>
+          <w:p>
+            <w:r>
+              <w:rPr>
+                <w:rFonts w:ascii="Arial" w:hAnsi="Arial"/>
+                <w:sz w:val="18"/>
+              </w:rPr>
+              <w:t>国宁新储（福建）科技</w:t>
+            </w:r>
+          </w:p>
+        </w:tc>
+        <w:tc>
+          <w:tcPr>
+            <w:tcW w:type="dxa" w:w="1560"/>
+          </w:tcPr>
+          <w:p>
+            <w:r>
+              <w:rPr>
+                <w:rFonts w:ascii="Arial" w:hAnsi="Arial"/>
+                <w:sz w:val="18"/>
+              </w:rPr>
+              <w:t>❌ 至今无校招</w:t>
+              <w:br/>
+              <w:t>全部社招(3年+经验)</w:t>
+            </w:r>
+          </w:p>
+        </w:tc>
+        <w:tc>
+          <w:tcPr>
+            <w:tcW w:type="dxa" w:w="1560"/>
+          </w:tcPr>
+          <w:p>
+            <w:r>
+              <w:rPr>
+                <w:rFonts w:ascii="Arial" w:hAnsi="Arial"/>
+                <w:sz w:val="18"/>
+              </w:rPr>
+              <w:t>—</w:t>
+            </w:r>
+          </w:p>
+        </w:tc>
+        <w:tc>
+          <w:tcPr>
+            <w:tcW w:type="dxa" w:w="1560"/>
+          </w:tcPr>
+          <w:p>
+            <w:r>
+              <w:rPr>
+                <w:rFonts w:ascii="Arial" w:hAnsi="Arial"/>
+                <w:sz w:val="18"/>
+              </w:rPr>
+              <w:t>宁德</w:t>
+            </w:r>
+          </w:p>
+        </w:tc>
+        <w:tc>
+          <w:tcPr>
+            <w:tcW w:type="dxa" w:w="1560"/>
+          </w:tcPr>
+          <w:p>
+            <w:r>
+              <w:rPr>
+                <w:rFonts w:ascii="Arial" w:hAnsi="Arial"/>
+                <w:sz w:val="18"/>
+              </w:rPr>
+              <w:t>gneszhaopin@163.com</w:t>
+              <w:br/>
+              <w:t>（可发邮件问秋招）</w:t>
+            </w:r>
+          </w:p>
+        </w:tc>
+        <w:tc>
+          <w:tcPr>
+            <w:tcW w:type="dxa" w:w="1560"/>
+          </w:tcPr>
+          <w:p>
+            <w:r>
+              <w:rPr>
+                <w:rFonts w:ascii="Arial" w:hAnsi="Arial"/>
+                <w:sz w:val="18"/>
+              </w:rPr>
+              <w:t>⭐</w:t>
+              <w:br/>
+              <w:t>观望</w:t>
+            </w:r>
+          </w:p>
+        </w:tc>
+      </w:tr>
+    </w:tbl>
+    <w:p/>
+    <w:p>
+      <w:pPr>
+        <w:pStyle w:val="Heading3"/>
+      </w:pPr>
+      <w:r>
+        <w:rPr>
+          <w:rFonts w:ascii="Arial" w:hAnsi="Arial"/>
+          <w:color w:val="34495E"/>
+          <w:sz w:val="24"/>
+        </w:rPr>
+        <w:t>关键结论</w:t>
+      </w:r>
+    </w:p>
+    <w:p>
+      <w:pPr>
+        <w:pStyle w:val="ListBullet"/>
+      </w:pPr>
+      <w:r>
+        <w:rPr>
+          <w:rFonts w:ascii="Arial" w:hAnsi="Arial"/>
+          <w:sz w:val="20"/>
+        </w:rPr>
+        <w:t>① 中国电气装备储能科技 + 广州储能集团 是文件里最值得投的两家，都有明确校招、岗位对口、待遇优厚</w:t>
+      </w:r>
+    </w:p>
+    <w:p>
+      <w:pPr>
+        <w:pStyle w:val="ListBullet"/>
+      </w:pPr>
+      <w:r>
+        <w:rPr>
+          <w:rFonts w:ascii="Arial" w:hAnsi="Arial"/>
+          <w:sz w:val="20"/>
+        </w:rPr>
+        <w:t>② 中国资源循环集团是2025年新央企，化学/材料专业在这里是优势不是短板，深圳有子公司</w:t>
+      </w:r>
+    </w:p>
+    <w:p>
+      <w:pPr>
+        <w:pStyle w:val="ListBullet"/>
+      </w:pPr>
+      <w:r>
+        <w:rPr>
+          <w:rFonts w:ascii="Arial" w:hAnsi="Arial"/>
+          <w:sz w:val="20"/>
+        </w:rPr>
+        <w:t>③ 国宁新储至今未开校招，不要等，偶尔关注即可</w:t>
+      </w:r>
+    </w:p>
+    <w:p>
+      <w:pPr>
+        <w:pStyle w:val="ListBullet"/>
+      </w:pPr>
+      <w:r>
+        <w:rPr>
+          <w:rFonts w:ascii="Arial" w:hAnsi="Arial"/>
+          <w:sz w:val="20"/>
+        </w:rPr>
+        <w:t>④ CATL校招一直开着，专业门槛问题仍未解决，当冲刺项投</w:t>
+      </w:r>
+    </w:p>
+    <w:p>
+      <w:pPr>
+        <w:pStyle w:val="ListBullet"/>
+      </w:pPr>
+      <w:r>
+        <w:rPr>
+          <w:rFonts w:ascii="Arial" w:hAnsi="Arial"/>
+          <w:sz w:val="20"/>
+        </w:rPr>
+        <w:t>⑤ 这些新设公司的校招窗口通常很窄（第一年最好进），看到公告要第一时间投</w:t>
+      </w:r>
+    </w:p>
+    <w:p>
+      <w:pPr>
+        <w:pStyle w:val="Heading2"/>
+      </w:pPr>
+      <w:r>
+        <w:rPr>
+          <w:rFonts w:ascii="Arial" w:hAnsi="Arial"/>
+          <w:color w:val="2C3E50"/>
+          <w:sz w:val="28"/>
+        </w:rPr>
+        <w:t>五、完整 N档·新设扩产待核验 名单（按省份）</w:t>
+      </w:r>
+    </w:p>
+    <w:p>
+      <w:r>
+        <w:rPr>
+          <w:rFonts w:ascii="Arial" w:hAnsi="Arial"/>
+          <w:b w:val="0"/>
+          <w:sz w:val="19"/>
+        </w:rPr>
+        <w:t>注：以下企业来自原 Excel 分类 'N档·新设扩产待核验' + '新增补充'，校招状态请参考上一章节的验证结果。</w:t>
       </w:r>
     </w:p>
     <w:p>
@@ -6343,7 +7136,7 @@
           <w:color w:val="2C3E50"/>
           <w:sz w:val="28"/>
         </w:rPr>
-        <w:t>五、针对新设公司的投递策略</w:t>
+        <w:t>六、针对新设公司的投递策略</w:t>
       </w:r>
     </w:p>
     <w:p>

</xml_diff>